<commit_message>
Align market and competitor figures to the same 1-year period
Co-Authored-By: Claude Opus 5.5 <noreply@anthropic.com>
Claude-Session: https://claude.ai/code/session_01EgwjKoCJ5A1Np3EugEUo7t
</commit_message>
<xml_diff>
--- a/理事長報告_実績連絡会20261028_修正案.docx
+++ b/理事長報告_実績連絡会20261028_修正案.docx
@@ -925,14 +925,14 @@
           <w:rFonts w:ascii="游ゴシック" w:hAnsi="游ゴシック" w:eastAsia="游ゴシック"/>
           <w:b/>
         </w:rPr>
-        <w:t>市場は横ばい：</w:t>
+        <w:t>市場は伸びが止まった：</w:t>
       </w:r>
       <w:r>
         <w:rPr>
           <w:rFonts w:ascii="游ゴシック" w:hAnsi="游ゴシック" w:eastAsia="游ゴシック"/>
           <w:b w:val="0"/>
         </w:rPr>
-        <w:t>西東京市の訪問診療利用者数は 2024年1,126人（307＋819）→ 2025年1,130人（340＋790）と、伸びが止まっている。</w:t>
+        <w:t>西東京市の訪問診療利用者数は、2022年904人から2024年1,126人へ増加した後、2025年は1,130人（前年比＋0.4%）と横ばいになっている。</w:t>
       </w:r>
     </w:p>
     <w:p>
@@ -952,14 +952,14 @@
           <w:rFonts w:ascii="游ゴシック" w:hAnsi="游ゴシック" w:eastAsia="游ゴシック"/>
           <w:b/>
         </w:rPr>
-        <w:t>競合は増加：</w:t>
+        <w:t>競合は増え続けている：</w:t>
       </w:r>
       <w:r>
         <w:rPr>
           <w:rFonts w:ascii="游ゴシック" w:hAnsi="游ゴシック" w:eastAsia="游ゴシック"/>
           <w:b w:val="0"/>
         </w:rPr>
-        <w:t>診療範囲8km圏内に機能強化型在支診108院（過去4年で＋9%）、在支診全体230院（同＋2%）、在支病19院。</w:t>
+        <w:t>診療範囲8km圏内の機能強化型在支診は2024年83院→2025年99院（前年比＋19%）、在支診全体は208院→225院（同＋8%）。2026年6月時点では機能強化型108院、在支診全体230院、在支病19院。</w:t>
       </w:r>
     </w:p>
     <w:p>

</xml_diff>